<commit_message>
Ghi điều kiện tài trợ công bố quốc tế của Học viện vào checklist; sửa chỗ điền tác giả, lời cảm ơn, tài trợ
Co-Authored-By: Claude Opus 5.5 <noreply@anthropic.com>
Claude-Session: https://claude.ai/code/session_012tLfSWXFiJ8KJH7nwqmjYj
</commit_message>
<xml_diff>
--- a/docs/bai_nckh/manuscript_en_article.docx
+++ b/docs/bai_nckh/manuscript_en_article.docx
@@ -15,7 +15,7 @@
         <w:pStyle w:val="FirstParagraph"/>
       </w:pPr>
       <w:r>
-        <w:t xml:space="preserve">[Author names]¹</w:t>
+        <w:t xml:space="preserve">[Author names, including at least one staff member of the Banking Academy of Vietnam; ORCID for each author]¹</w:t>
       </w:r>
     </w:p>
     <w:p>
@@ -31,7 +31,13 @@
         <w:pStyle w:val="BodyText"/>
       </w:pPr>
       <w:r>
-        <w:t xml:space="preserve">Corresponding author: [name, email]</w:t>
+        <w:t xml:space="preserve">Corresponding author:</w:t>
+      </w:r>
+      <w:r>
+        <w:t xml:space="preserve"> </w:t>
+      </w:r>
+      <w:r>
+        <w:t xml:space="preserve">[name, @hvnh.edu.vn email, ORCID]</w:t>
       </w:r>
     </w:p>
     <w:p>
@@ -10959,7 +10965,7 @@
         <w:t xml:space="preserve"> </w:t>
       </w:r>
       <w:r>
-        <w:t xml:space="preserve">We thank the participants and the community organizations that circulated the questionnaire. [Authors: add the project supervisor and the experts consulted on the questionnaire.]</w:t>
+        <w:t xml:space="preserve">We thank the participants and the community organizations that circulated the questionnaire. [Authors: add the project supervisor and the experts consulted on the questionnaire. Add the sentence acknowledging support from the Banking Academy of Vietnam, worded as agreed with the Banking Research Institute; do not cite a grant number unless one has been issued.]</w:t>
       </w:r>
     </w:p>
     <w:p>
@@ -10995,16 +11001,7 @@
         <w:t xml:space="preserve"> </w:t>
       </w:r>
       <w:r>
-        <w:t xml:space="preserve">[Authors: state the funding source, or</w:t>
-      </w:r>
-      <w:r>
-        <w:t xml:space="preserve"> </w:t>
-      </w:r>
-      <w:r>
-        <w:t xml:space="preserve">“This research received no specific funding.”</w:t>
-      </w:r>
-      <w:r>
-        <w:t xml:space="preserve">]</w:t>
+        <w:t xml:space="preserve">[Authors: state the support from the Banking Academy of Vietnam in the wording agreed with the Banking Research Institute, consistent with the Acknowledgements.]</w:t>
       </w:r>
     </w:p>
     <w:p>

</xml_diff>